<commit_message>
feat(skytek): customer logo slot and rotated watermark, version 0.4.0
Cover now shows the vendor logo beside a dashed-border placeholder labelled
"Customer logo". New optional schema field client_logo_path (PNG/JPG) embeds
the client's real logo there when given; a missing or unreadable file is
rejected with exit 2 before anything is written.

The SkyTek logo is also anchored behind the text of every page as a
watermark, rotated 45 degrees at 20% opacity so it doesn't fight the cover
title. Both the rotation and the opacity are baked into the PNG's pixels
rather than left to OOXML picture effects, so Word and the LibreOffice
headless PDF conversion render it the same way.

Additive, not breaking: client_logo_path is optional with no default
required, so existing 0.3.0 .sow.json files still validate.

Tests: 18 pass, including the placeholder, embedding a given logo, and
rejecting a missing or unreadable one.

Co-Authored-By: Claude Opus 5.5 <noreply@anthropic.com>
</commit_message>
<xml_diff>
--- a/plugins/skytek/skills/create-sow/assets/sow-template.docx
+++ b/plugins/skytek/skills/create-sow/assets/sow-template.docx
@@ -2,43 +2,84 @@
 <file path=word/document.xml><?xml version="1.0" encoding="utf-8"?>
 <w:document xmlns:wpc="http://schemas.microsoft.com/office/word/2010/wordprocessingCanvas" xmlns:mo="http://schemas.microsoft.com/office/mac/office/2008/main" xmlns:mc="http://schemas.openxmlformats.org/markup-compatibility/2006" xmlns:mv="urn:schemas-microsoft-com:mac:vml" xmlns:o="urn:schemas-microsoft-com:office:office" xmlns:r="http://schemas.openxmlformats.org/officeDocument/2006/relationships" xmlns:m="http://schemas.openxmlformats.org/officeDocument/2006/math" xmlns:v="urn:schemas-microsoft-com:vml" xmlns:wp14="http://schemas.microsoft.com/office/word/2010/wordprocessingDrawing" xmlns:wp="http://schemas.openxmlformats.org/drawingml/2006/wordprocessingDrawing" xmlns:w10="urn:schemas-microsoft-com:office:word" xmlns:w="http://schemas.openxmlformats.org/wordprocessingml/2006/main" xmlns:w14="http://schemas.microsoft.com/office/word/2010/wordml" xmlns:wpg="http://schemas.microsoft.com/office/word/2010/wordprocessingGroup" xmlns:wpi="http://schemas.microsoft.com/office/word/2010/wordprocessingInk" xmlns:wne="http://schemas.microsoft.com/office/word/2006/wordml" xmlns:wps="http://schemas.microsoft.com/office/word/2010/wordprocessingShape" mc:Ignorable="w14 wp14">
   <w:body>
-    <w:p>
-      <w:r>
-        <w:drawing>
-          <wp:inline xmlns:a="http://schemas.openxmlformats.org/drawingml/2006/main" xmlns:pic="http://schemas.openxmlformats.org/drawingml/2006/picture">
-            <wp:extent cx="2377440" cy="533438"/>
-            <wp:docPr id="1" name="Picture 1"/>
-            <wp:cNvGraphicFramePr>
-              <a:graphicFrameLocks noChangeAspect="1"/>
-            </wp:cNvGraphicFramePr>
-            <a:graphic>
-              <a:graphicData uri="http://schemas.openxmlformats.org/drawingml/2006/picture">
-                <pic:pic>
-                  <pic:nvPicPr>
-                    <pic:cNvPr id="0" name="image.png"/>
-                    <pic:cNvPicPr/>
-                  </pic:nvPicPr>
-                  <pic:blipFill>
-                    <a:blip r:embed="rId11"/>
-                    <a:stretch>
-                      <a:fillRect/>
-                    </a:stretch>
-                  </pic:blipFill>
-                  <pic:spPr>
-                    <a:xfrm>
-                      <a:off x="0" y="0"/>
-                      <a:ext cx="2377440" cy="533438"/>
-                    </a:xfrm>
-                    <a:prstGeom prst="rect"/>
-                  </pic:spPr>
-                </pic:pic>
-              </a:graphicData>
-            </a:graphic>
-          </wp:inline>
-        </w:drawing>
-      </w:r>
-    </w:p>
-    <w:p/>
+    <w:tbl>
+      <w:tblPr>
+        <w:tblW w:type="auto" w:w="0"/>
+        <w:tblLayout w:type="fixed"/>
+        <w:tblLook w:firstColumn="1" w:firstRow="1" w:lastColumn="0" w:lastRow="0" w:noHBand="0" w:noVBand="1" w:val="04A0"/>
+      </w:tblPr>
+      <w:tblGrid>
+        <w:gridCol w:w="4320"/>
+        <w:gridCol w:w="4320"/>
+      </w:tblGrid>
+      <w:tr>
+        <w:tc>
+          <w:tcPr>
+            <w:tcW w:type="dxa" w:w="4320"/>
+          </w:tcPr>
+          <w:p>
+            <w:r>
+              <w:drawing>
+                <wp:inline xmlns:a="http://schemas.openxmlformats.org/drawingml/2006/main" xmlns:pic="http://schemas.openxmlformats.org/drawingml/2006/picture">
+                  <wp:extent cx="2011680" cy="451371"/>
+                  <wp:docPr id="1" name="Picture 1"/>
+                  <wp:cNvGraphicFramePr>
+                    <a:graphicFrameLocks noChangeAspect="1"/>
+                  </wp:cNvGraphicFramePr>
+                  <a:graphic>
+                    <a:graphicData uri="http://schemas.openxmlformats.org/drawingml/2006/picture">
+                      <pic:pic>
+                        <pic:nvPicPr>
+                          <pic:cNvPr id="0" name="image.png"/>
+                          <pic:cNvPicPr/>
+                        </pic:nvPicPr>
+                        <pic:blipFill>
+                          <a:blip r:embed="rId12"/>
+                          <a:stretch>
+                            <a:fillRect/>
+                          </a:stretch>
+                        </pic:blipFill>
+                        <pic:spPr>
+                          <a:xfrm>
+                            <a:off x="0" y="0"/>
+                            <a:ext cx="2011680" cy="451371"/>
+                          </a:xfrm>
+                          <a:prstGeom prst="rect"/>
+                        </pic:spPr>
+                      </pic:pic>
+                    </a:graphicData>
+                  </a:graphic>
+                </wp:inline>
+              </w:drawing>
+            </w:r>
+          </w:p>
+        </w:tc>
+        <w:tc>
+          <w:tcPr>
+            <w:tcW w:type="dxa" w:w="4320"/>
+            <w:vAlign w:val="center"/>
+            <w:tcBorders>
+              <w:top w:val="dashed" w:sz="6" w:color="A6ACB0"/>
+              <w:left w:val="dashed" w:sz="6" w:color="A6ACB0"/>
+              <w:bottom w:val="dashed" w:sz="6" w:color="A6ACB0"/>
+              <w:right w:val="dashed" w:sz="6" w:color="A6ACB0"/>
+            </w:tcBorders>
+          </w:tcPr>
+          <w:p>
+            <w:pPr>
+              <w:spacing w:before="560" w:after="560"/>
+              <w:jc w:val="center"/>
+            </w:pPr>
+            <w:r>
+              <w:rPr>
+                <w:color w:val="5F6B73"/>
+              </w:rPr>
+              <w:t>{% if client_logo_path %}{{ client_logo }}{% else %}Customer logo{% endif %}</w:t>
+            </w:r>
+          </w:p>
+        </w:tc>
+      </w:tr>
+    </w:tbl>
     <w:p/>
     <w:p/>
     <w:p/>
@@ -3171,8 +3212,9 @@
       </w:tr>
     </w:tbl>
     <w:sectPr>
-      <w:headerReference w:type="default" r:id="rId9"/>
-      <w:footerReference w:type="default" r:id="rId10"/>
+      <w:headerReference w:type="first" r:id="rId9"/>
+      <w:headerReference w:type="default" r:id="rId10"/>
+      <w:footerReference w:type="default" r:id="rId11"/>
       <w:pgSz w:w="12240" w:h="15840"/>
       <w:pgMar w:top="1440" w:right="1440" w:bottom="1440" w:left="1440" w:header="648" w:footer="648" w:gutter="0"/>
       <w:cols w:space="720"/>
@@ -3244,9 +3286,103 @@
     </w:pPr>
     <w:r>
       <w:drawing>
+        <wp:anchor distT="0" distB="0" distL="0" distR="0" simplePos="0" relativeHeight="1" locked="0" layoutInCell="1" allowOverlap="1" behindDoc="1">
+          <wp:simplePos x="0" y="0"/>
+          <wp:positionH relativeFrom="page">
+            <wp:align>center</wp:align>
+          </wp:positionH>
+          <wp:positionV relativeFrom="page">
+            <wp:align>center</wp:align>
+          </wp:positionV>
+          <wp:extent cx="5029200" cy="5032829"/>
+          <wp:wrapNone/>
+          <wp:docPr id="1" name="Picture 1"/>
+          <wp:cNvGraphicFramePr xmlns:a="http://schemas.openxmlformats.org/drawingml/2006/main">
+            <a:graphicFrameLocks noChangeAspect="1"/>
+          </wp:cNvGraphicFramePr>
+          <a:graphic xmlns:a="http://schemas.openxmlformats.org/drawingml/2006/main" xmlns:pic="http://schemas.openxmlformats.org/drawingml/2006/picture">
+            <a:graphicData uri="http://schemas.openxmlformats.org/drawingml/2006/picture">
+              <pic:pic>
+                <pic:nvPicPr>
+                  <pic:cNvPr id="0" name="image.png"/>
+                  <pic:cNvPicPr/>
+                </pic:nvPicPr>
+                <pic:blipFill>
+                  <a:blip r:embed="rId1"/>
+                  <a:stretch>
+                    <a:fillRect/>
+                  </a:stretch>
+                </pic:blipFill>
+                <pic:spPr>
+                  <a:xfrm>
+                    <a:off x="0" y="0"/>
+                    <a:ext cx="5029200" cy="5032829"/>
+                  </a:xfrm>
+                  <a:prstGeom prst="rect"/>
+                </pic:spPr>
+              </pic:pic>
+            </a:graphicData>
+          </a:graphic>
+        </wp:anchor>
+      </w:drawing>
+    </w:r>
+  </w:p>
+</w:hdr>
+</file>
+
+<file path=word/header2.xml><?xml version="1.0" encoding="utf-8"?>
+<w:hdr xmlns:m="http://schemas.openxmlformats.org/officeDocument/2006/math" xmlns:mc="http://schemas.openxmlformats.org/markup-compatibility/2006" xmlns:mo="http://schemas.microsoft.com/office/mac/office/2008/main" xmlns:mv="urn:schemas-microsoft-com:mac:vml" xmlns:o="urn:schemas-microsoft-com:office:office" xmlns:r="http://schemas.openxmlformats.org/officeDocument/2006/relationships" xmlns:v="urn:schemas-microsoft-com:vml" xmlns:w10="urn:schemas-microsoft-com:office:word" xmlns:w14="http://schemas.microsoft.com/office/word/2010/wordml" xmlns:w="http://schemas.openxmlformats.org/wordprocessingml/2006/main" xmlns:wne="http://schemas.microsoft.com/office/word/2006/wordml" xmlns:wp14="http://schemas.microsoft.com/office/word/2010/wordprocessingDrawing" xmlns:wp="http://schemas.openxmlformats.org/drawingml/2006/wordprocessingDrawing" xmlns:wpc="http://schemas.microsoft.com/office/word/2010/wordprocessingCanvas" xmlns:wpg="http://schemas.microsoft.com/office/word/2010/wordprocessingGroup" xmlns:wpi="http://schemas.microsoft.com/office/word/2010/wordprocessingInk" xmlns:wps="http://schemas.microsoft.com/office/word/2010/wordprocessingShape" mc:Ignorable="w14 wp14">
+  <w:p>
+    <w:pPr>
+      <w:pStyle w:val="Header"/>
+    </w:pPr>
+    <w:r>
+      <w:drawing>
+        <wp:anchor distT="0" distB="0" distL="0" distR="0" simplePos="0" relativeHeight="1" locked="0" layoutInCell="1" allowOverlap="1" behindDoc="1">
+          <wp:simplePos x="0" y="0"/>
+          <wp:positionH relativeFrom="page">
+            <wp:align>center</wp:align>
+          </wp:positionH>
+          <wp:positionV relativeFrom="page">
+            <wp:align>center</wp:align>
+          </wp:positionV>
+          <wp:extent cx="5029200" cy="5032829"/>
+          <wp:wrapNone/>
+          <wp:docPr id="1" name="Picture 1"/>
+          <wp:cNvGraphicFramePr xmlns:a="http://schemas.openxmlformats.org/drawingml/2006/main">
+            <a:graphicFrameLocks noChangeAspect="1"/>
+          </wp:cNvGraphicFramePr>
+          <a:graphic xmlns:a="http://schemas.openxmlformats.org/drawingml/2006/main" xmlns:pic="http://schemas.openxmlformats.org/drawingml/2006/picture">
+            <a:graphicData uri="http://schemas.openxmlformats.org/drawingml/2006/picture">
+              <pic:pic>
+                <pic:nvPicPr>
+                  <pic:cNvPr id="0" name="image.png"/>
+                  <pic:cNvPicPr/>
+                </pic:nvPicPr>
+                <pic:blipFill>
+                  <a:blip r:embed="rId1"/>
+                  <a:stretch>
+                    <a:fillRect/>
+                  </a:stretch>
+                </pic:blipFill>
+                <pic:spPr>
+                  <a:xfrm>
+                    <a:off x="0" y="0"/>
+                    <a:ext cx="5029200" cy="5032829"/>
+                  </a:xfrm>
+                  <a:prstGeom prst="rect"/>
+                </pic:spPr>
+              </pic:pic>
+            </a:graphicData>
+          </a:graphic>
+        </wp:anchor>
+      </w:drawing>
+    </w:r>
+    <w:r>
+      <w:drawing>
         <wp:inline xmlns:a="http://schemas.openxmlformats.org/drawingml/2006/main" xmlns:pic="http://schemas.openxmlformats.org/drawingml/2006/picture">
           <wp:extent cx="1005840" cy="225685"/>
-          <wp:docPr id="1" name="Picture 1"/>
+          <wp:docPr id="2" name="Picture 2"/>
           <wp:cNvGraphicFramePr>
             <a:graphicFrameLocks noChangeAspect="1"/>
           </wp:cNvGraphicFramePr>
@@ -3258,7 +3394,7 @@
                   <pic:cNvPicPr/>
                 </pic:nvPicPr>
                 <pic:blipFill>
-                  <a:blip r:embed="rId1"/>
+                  <a:blip r:embed="rId2"/>
                   <a:stretch>
                     <a:fillRect/>
                   </a:stretch>

</xml_diff>

<commit_message>
feat(skytek): A4 layout, TWK Lausanne/Everett fonts, embedded fonts, version 0.5.0
- Page size: A4 (210 × 297 mm), was Letter (8.5 × 11 in)
- Body text: TWK Lausanne 300 (lighter), was Arial 10.5pt
- Title: TWK Everett Black (800 weight)
- Headers/bold labels: TWK Lausanne 550 (no synthetic bold), was faux-bolded 400
- All fonts embedded in template (ECMA-376 obfuscation) so rendering works on any machine
- Table column widths scaled from 6.5in (Letter) to 6.27in (A4 content width)
- New script embed_fonts.py handles automatic font embedding during template builds

Signed fonts require Weltkern licence; embedded templates render correctly offline.

Co-Authored-By: Claude Opus 5.5 <noreply@anthropic.com>
</commit_message>
<xml_diff>
--- a/plugins/skytek/skills/create-sow/assets/sow-template.docx
+++ b/plugins/skytek/skills/create-sow/assets/sow-template.docx
@@ -9,13 +9,13 @@
         <w:tblLook w:firstColumn="1" w:firstRow="1" w:lastColumn="0" w:lastRow="0" w:noHBand="0" w:noVBand="1" w:val="04A0"/>
       </w:tblPr>
       <w:tblGrid>
-        <w:gridCol w:w="4320"/>
-        <w:gridCol w:w="4320"/>
+        <w:gridCol w:w="4161"/>
+        <w:gridCol w:w="4161"/>
       </w:tblGrid>
       <w:tr>
         <w:tc>
           <w:tcPr>
-            <w:tcW w:type="dxa" w:w="4320"/>
+            <w:tcW w:type="dxa" w:w="4162"/>
           </w:tcPr>
           <w:p>
             <w:r>
@@ -56,7 +56,7 @@
         </w:tc>
         <w:tc>
           <w:tcPr>
-            <w:tcW w:type="dxa" w:w="4320"/>
+            <w:tcW w:type="dxa" w:w="4162"/>
             <w:vAlign w:val="center"/>
             <w:tcBorders>
               <w:top w:val="dashed" w:sz="6" w:color="A6ACB0"/>
@@ -90,9 +90,10 @@
       </w:pPr>
       <w:r>
         <w:rPr>
-          <w:b/>
+          <w:rFonts w:ascii="TWK Everett Black" w:hAnsi="TWK Everett Black"/>
+          <w:b w:val="0"/>
           <w:color w:val="1C2B33"/>
-          <w:sz w:val="68"/>
+          <w:sz w:val="71"/>
         </w:rPr>
         <w:t>Scope of Work</w:t>
       </w:r>
@@ -103,9 +104,10 @@
       </w:pPr>
       <w:r>
         <w:rPr>
+          <w:rFonts w:ascii="TWK Everett Bold" w:hAnsi="TWK Everett Bold"/>
           <w:b w:val="0"/>
           <w:color w:val="0064E0"/>
-          <w:sz w:val="36"/>
+          <w:sz w:val="38"/>
         </w:rPr>
         <w:t>{{ project_title }}</w:t>
       </w:r>
@@ -117,13 +119,13 @@
         <w:tblLook w:firstColumn="1" w:firstRow="1" w:lastColumn="0" w:lastRow="0" w:noHBand="0" w:noVBand="1" w:val="04A0"/>
       </w:tblPr>
       <w:tblGrid>
-        <w:gridCol w:w="2160"/>
-        <w:gridCol w:w="7200"/>
+        <w:gridCol w:w="2088"/>
+        <w:gridCol w:w="6940"/>
       </w:tblGrid>
       <w:tr>
         <w:tc>
           <w:tcPr>
-            <w:tcW w:type="dxa" w:w="2160"/>
+            <w:tcW w:type="dxa" w:w="2088"/>
           </w:tcPr>
           <w:p>
             <w:r>
@@ -137,12 +139,12 @@
         </w:tc>
         <w:tc>
           <w:tcPr>
-            <w:tcW w:type="dxa" w:w="7200"/>
+            <w:tcW w:type="dxa" w:w="6941"/>
           </w:tcPr>
           <w:p>
             <w:r>
               <w:rPr>
-                <w:b/>
+                <w:rFonts w:ascii="TWK Lausanne 550" w:hAnsi="TWK Lausanne 550"/>
               </w:rPr>
               <w:t>{{ client_name }}</w:t>
             </w:r>
@@ -152,7 +154,7 @@
       <w:tr>
         <w:tc>
           <w:tcPr>
-            <w:tcW w:type="dxa" w:w="2160"/>
+            <w:tcW w:type="dxa" w:w="2088"/>
           </w:tcPr>
           <w:p>
             <w:r>
@@ -166,12 +168,12 @@
         </w:tc>
         <w:tc>
           <w:tcPr>
-            <w:tcW w:type="dxa" w:w="7200"/>
+            <w:tcW w:type="dxa" w:w="6941"/>
           </w:tcPr>
           <w:p>
             <w:r>
               <w:rPr>
-                <w:b/>
+                <w:rFonts w:ascii="TWK Lausanne 550" w:hAnsi="TWK Lausanne 550"/>
               </w:rPr>
               <w:t>{{ vendor_name }}</w:t>
             </w:r>
@@ -181,7 +183,7 @@
       <w:tr>
         <w:tc>
           <w:tcPr>
-            <w:tcW w:type="dxa" w:w="2160"/>
+            <w:tcW w:type="dxa" w:w="2088"/>
           </w:tcPr>
           <w:p>
             <w:r>
@@ -195,12 +197,12 @@
         </w:tc>
         <w:tc>
           <w:tcPr>
-            <w:tcW w:type="dxa" w:w="7200"/>
+            <w:tcW w:type="dxa" w:w="6941"/>
           </w:tcPr>
           <w:p>
             <w:r>
               <w:rPr>
-                <w:b/>
+                <w:rFonts w:ascii="TWK Lausanne 550" w:hAnsi="TWK Lausanne 550"/>
               </w:rPr>
               <w:t>{{ sow_date }}</w:t>
             </w:r>
@@ -210,7 +212,7 @@
       <w:tr>
         <w:tc>
           <w:tcPr>
-            <w:tcW w:type="dxa" w:w="2160"/>
+            <w:tcW w:type="dxa" w:w="2088"/>
           </w:tcPr>
           <w:p>
             <w:r>
@@ -224,12 +226,12 @@
         </w:tc>
         <w:tc>
           <w:tcPr>
-            <w:tcW w:type="dxa" w:w="7200"/>
+            <w:tcW w:type="dxa" w:w="6941"/>
           </w:tcPr>
           <w:p>
             <w:r>
               <w:rPr>
-                <w:b/>
+                <w:rFonts w:ascii="TWK Lausanne 550" w:hAnsi="TWK Lausanne 550"/>
               </w:rPr>
               <w:t>{{ version }}</w:t>
             </w:r>
@@ -239,7 +241,7 @@
       <w:tr>
         <w:tc>
           <w:tcPr>
-            <w:tcW w:type="dxa" w:w="2160"/>
+            <w:tcW w:type="dxa" w:w="2088"/>
           </w:tcPr>
           <w:p>
             <w:r>
@@ -249,7 +251,7 @@
         </w:tc>
         <w:tc>
           <w:tcPr>
-            <w:tcW w:type="dxa" w:w="7200"/>
+            <w:tcW w:type="dxa" w:w="6941"/>
           </w:tcPr>
           <w:p/>
         </w:tc>
@@ -257,7 +259,7 @@
       <w:tr>
         <w:tc>
           <w:tcPr>
-            <w:tcW w:type="dxa" w:w="2160"/>
+            <w:tcW w:type="dxa" w:w="2088"/>
           </w:tcPr>
           <w:p>
             <w:r>
@@ -271,12 +273,12 @@
         </w:tc>
         <w:tc>
           <w:tcPr>
-            <w:tcW w:type="dxa" w:w="7200"/>
+            <w:tcW w:type="dxa" w:w="6941"/>
           </w:tcPr>
           <w:p>
             <w:r>
               <w:rPr>
-                <w:b/>
+                <w:rFonts w:ascii="TWK Lausanne 550" w:hAnsi="TWK Lausanne 550"/>
               </w:rPr>
               <w:t>{{ author }}</w:t>
             </w:r>
@@ -286,7 +288,7 @@
       <w:tr>
         <w:tc>
           <w:tcPr>
-            <w:tcW w:type="dxa" w:w="2160"/>
+            <w:tcW w:type="dxa" w:w="2088"/>
           </w:tcPr>
           <w:p>
             <w:r>
@@ -296,7 +298,7 @@
         </w:tc>
         <w:tc>
           <w:tcPr>
-            <w:tcW w:type="dxa" w:w="7200"/>
+            <w:tcW w:type="dxa" w:w="6941"/>
           </w:tcPr>
           <w:p/>
         </w:tc>
@@ -327,9 +329,10 @@
       </w:pPr>
       <w:r>
         <w:rPr>
-          <w:b/>
+          <w:rFonts w:ascii="TWK Everett Bold" w:hAnsi="TWK Everett Bold"/>
+          <w:b w:val="0"/>
           <w:color w:val="1C2B33"/>
-          <w:sz w:val="44"/>
+          <w:sz w:val="46"/>
         </w:rPr>
         <w:t>Scope of Work</w:t>
       </w:r>
@@ -340,9 +343,10 @@
       </w:pPr>
       <w:r>
         <w:rPr>
+          <w:rFonts w:ascii="TWK Everett Medium" w:hAnsi="TWK Everett Medium"/>
           <w:b w:val="0"/>
           <w:color w:val="0064E0"/>
-          <w:sz w:val="28"/>
+          <w:sz w:val="29"/>
         </w:rPr>
         <w:t>{{ project_title }}</w:t>
       </w:r>
@@ -358,9 +362,10 @@
       </w:pPr>
       <w:r>
         <w:rPr>
-          <w:b/>
+          <w:rFonts w:ascii="TWK Everett Medium" w:hAnsi="TWK Everett Medium"/>
+          <w:b w:val="0"/>
           <w:color w:val="1C2B33"/>
-          <w:sz w:val="26"/>
+          <w:sz w:val="27"/>
         </w:rPr>
         <w:t>Contents</w:t>
       </w:r>
@@ -611,8 +616,8 @@
         <w:tblLook w:firstColumn="1" w:firstRow="1" w:lastColumn="0" w:lastRow="0" w:noHBand="0" w:noVBand="1" w:val="04A0"/>
       </w:tblPr>
       <w:tblGrid>
-        <w:gridCol w:w="720"/>
-        <w:gridCol w:w="8640"/>
+        <w:gridCol w:w="691"/>
+        <w:gridCol w:w="8337"/>
       </w:tblGrid>
       <w:tr>
         <w:trPr>
@@ -620,13 +625,13 @@
         </w:trPr>
         <w:tc>
           <w:tcPr>
-            <w:tcW w:type="dxa" w:w="720"/>
+            <w:tcW w:type="dxa" w:w="691"/>
             <w:shd w:val="clear" w:color="auto" w:fill="0064E0"/>
           </w:tcPr>
           <w:p>
             <w:r>
               <w:rPr>
-                <w:b/>
+                <w:rFonts w:ascii="TWK Lausanne 550" w:hAnsi="TWK Lausanne 550"/>
                 <w:color w:val="FFFFFF"/>
               </w:rPr>
               <w:t>#</w:t>
@@ -635,13 +640,13 @@
         </w:tc>
         <w:tc>
           <w:tcPr>
-            <w:tcW w:type="dxa" w:w="8640"/>
+            <w:tcW w:type="dxa" w:w="8338"/>
             <w:shd w:val="clear" w:color="auto" w:fill="0064E0"/>
           </w:tcPr>
           <w:p>
             <w:r>
               <w:rPr>
-                <w:b/>
+                <w:rFonts w:ascii="TWK Lausanne 550" w:hAnsi="TWK Lausanne 550"/>
                 <w:color w:val="FFFFFF"/>
               </w:rPr>
               <w:t>Functional requirement</w:t>
@@ -652,7 +657,7 @@
       <w:tr>
         <w:tc>
           <w:tcPr>
-            <w:tcW w:type="dxa" w:w="720"/>
+            <w:tcW w:type="dxa" w:w="691"/>
           </w:tcPr>
           <w:p>
             <w:r>
@@ -662,7 +667,7 @@
         </w:tc>
         <w:tc>
           <w:tcPr>
-            <w:tcW w:type="dxa" w:w="8640"/>
+            <w:tcW w:type="dxa" w:w="8338"/>
           </w:tcPr>
           <w:p/>
         </w:tc>
@@ -670,7 +675,7 @@
       <w:tr>
         <w:tc>
           <w:tcPr>
-            <w:tcW w:type="dxa" w:w="720"/>
+            <w:tcW w:type="dxa" w:w="691"/>
           </w:tcPr>
           <w:p>
             <w:r>
@@ -680,7 +685,7 @@
         </w:tc>
         <w:tc>
           <w:tcPr>
-            <w:tcW w:type="dxa" w:w="8640"/>
+            <w:tcW w:type="dxa" w:w="8338"/>
           </w:tcPr>
           <w:p>
             <w:r>
@@ -692,7 +697,7 @@
       <w:tr>
         <w:tc>
           <w:tcPr>
-            <w:tcW w:type="dxa" w:w="720"/>
+            <w:tcW w:type="dxa" w:w="691"/>
           </w:tcPr>
           <w:p>
             <w:r>
@@ -702,7 +707,7 @@
         </w:tc>
         <w:tc>
           <w:tcPr>
-            <w:tcW w:type="dxa" w:w="8640"/>
+            <w:tcW w:type="dxa" w:w="8338"/>
           </w:tcPr>
           <w:p/>
         </w:tc>
@@ -736,8 +741,8 @@
         <w:tblLook w:firstColumn="1" w:firstRow="1" w:lastColumn="0" w:lastRow="0" w:noHBand="0" w:noVBand="1" w:val="04A0"/>
       </w:tblPr>
       <w:tblGrid>
-        <w:gridCol w:w="720"/>
-        <w:gridCol w:w="8640"/>
+        <w:gridCol w:w="691"/>
+        <w:gridCol w:w="8337"/>
       </w:tblGrid>
       <w:tr>
         <w:trPr>
@@ -745,13 +750,13 @@
         </w:trPr>
         <w:tc>
           <w:tcPr>
-            <w:tcW w:type="dxa" w:w="720"/>
+            <w:tcW w:type="dxa" w:w="691"/>
             <w:shd w:val="clear" w:color="auto" w:fill="0064E0"/>
           </w:tcPr>
           <w:p>
             <w:r>
               <w:rPr>
-                <w:b/>
+                <w:rFonts w:ascii="TWK Lausanne 550" w:hAnsi="TWK Lausanne 550"/>
                 <w:color w:val="FFFFFF"/>
               </w:rPr>
               <w:t>#</w:t>
@@ -760,13 +765,13 @@
         </w:tc>
         <w:tc>
           <w:tcPr>
-            <w:tcW w:type="dxa" w:w="8640"/>
+            <w:tcW w:type="dxa" w:w="8338"/>
             <w:shd w:val="clear" w:color="auto" w:fill="0064E0"/>
           </w:tcPr>
           <w:p>
             <w:r>
               <w:rPr>
-                <w:b/>
+                <w:rFonts w:ascii="TWK Lausanne 550" w:hAnsi="TWK Lausanne 550"/>
                 <w:color w:val="FFFFFF"/>
               </w:rPr>
               <w:t>Non-functional requirement</w:t>
@@ -777,7 +782,7 @@
       <w:tr>
         <w:tc>
           <w:tcPr>
-            <w:tcW w:type="dxa" w:w="720"/>
+            <w:tcW w:type="dxa" w:w="691"/>
           </w:tcPr>
           <w:p>
             <w:r>
@@ -787,7 +792,7 @@
         </w:tc>
         <w:tc>
           <w:tcPr>
-            <w:tcW w:type="dxa" w:w="8640"/>
+            <w:tcW w:type="dxa" w:w="8338"/>
           </w:tcPr>
           <w:p/>
         </w:tc>
@@ -795,7 +800,7 @@
       <w:tr>
         <w:tc>
           <w:tcPr>
-            <w:tcW w:type="dxa" w:w="720"/>
+            <w:tcW w:type="dxa" w:w="691"/>
           </w:tcPr>
           <w:p>
             <w:r>
@@ -805,7 +810,7 @@
         </w:tc>
         <w:tc>
           <w:tcPr>
-            <w:tcW w:type="dxa" w:w="8640"/>
+            <w:tcW w:type="dxa" w:w="8338"/>
           </w:tcPr>
           <w:p>
             <w:r>
@@ -817,7 +822,7 @@
       <w:tr>
         <w:tc>
           <w:tcPr>
-            <w:tcW w:type="dxa" w:w="720"/>
+            <w:tcW w:type="dxa" w:w="691"/>
           </w:tcPr>
           <w:p>
             <w:r>
@@ -827,7 +832,7 @@
         </w:tc>
         <w:tc>
           <w:tcPr>
-            <w:tcW w:type="dxa" w:w="8640"/>
+            <w:tcW w:type="dxa" w:w="8338"/>
           </w:tcPr>
           <w:p/>
         </w:tc>
@@ -901,8 +906,8 @@
         <w:tblLook w:firstColumn="1" w:firstRow="1" w:lastColumn="0" w:lastRow="0" w:noHBand="0" w:noVBand="1" w:val="04A0"/>
       </w:tblPr>
       <w:tblGrid>
-        <w:gridCol w:w="2880"/>
-        <w:gridCol w:w="6480"/>
+        <w:gridCol w:w="2779"/>
+        <w:gridCol w:w="6249"/>
       </w:tblGrid>
       <w:tr>
         <w:trPr>
@@ -910,13 +915,13 @@
         </w:trPr>
         <w:tc>
           <w:tcPr>
-            <w:tcW w:type="dxa" w:w="2880"/>
+            <w:tcW w:type="dxa" w:w="2779"/>
             <w:shd w:val="clear" w:color="auto" w:fill="0064E0"/>
           </w:tcPr>
           <w:p>
             <w:r>
               <w:rPr>
-                <w:b/>
+                <w:rFonts w:ascii="TWK Lausanne 550" w:hAnsi="TWK Lausanne 550"/>
                 <w:color w:val="FFFFFF"/>
               </w:rPr>
               <w:t>Component</w:t>
@@ -925,13 +930,13 @@
         </w:tc>
         <w:tc>
           <w:tcPr>
-            <w:tcW w:type="dxa" w:w="6480"/>
+            <w:tcW w:type="dxa" w:w="6250"/>
             <w:shd w:val="clear" w:color="auto" w:fill="0064E0"/>
           </w:tcPr>
           <w:p>
             <w:r>
               <w:rPr>
-                <w:b/>
+                <w:rFonts w:ascii="TWK Lausanne 550" w:hAnsi="TWK Lausanne 550"/>
                 <w:color w:val="FFFFFF"/>
               </w:rPr>
               <w:t>Role in the solution</w:t>
@@ -942,7 +947,7 @@
       <w:tr>
         <w:tc>
           <w:tcPr>
-            <w:tcW w:type="dxa" w:w="2880"/>
+            <w:tcW w:type="dxa" w:w="2779"/>
           </w:tcPr>
           <w:p>
             <w:r>
@@ -952,7 +957,7 @@
         </w:tc>
         <w:tc>
           <w:tcPr>
-            <w:tcW w:type="dxa" w:w="6480"/>
+            <w:tcW w:type="dxa" w:w="6250"/>
           </w:tcPr>
           <w:p/>
         </w:tc>
@@ -960,7 +965,7 @@
       <w:tr>
         <w:tc>
           <w:tcPr>
-            <w:tcW w:type="dxa" w:w="2880"/>
+            <w:tcW w:type="dxa" w:w="2779"/>
           </w:tcPr>
           <w:p>
             <w:r>
@@ -970,7 +975,7 @@
         </w:tc>
         <w:tc>
           <w:tcPr>
-            <w:tcW w:type="dxa" w:w="6480"/>
+            <w:tcW w:type="dxa" w:w="6250"/>
           </w:tcPr>
           <w:p>
             <w:r>
@@ -982,7 +987,7 @@
       <w:tr>
         <w:tc>
           <w:tcPr>
-            <w:tcW w:type="dxa" w:w="2880"/>
+            <w:tcW w:type="dxa" w:w="2779"/>
           </w:tcPr>
           <w:p>
             <w:r>
@@ -992,7 +997,7 @@
         </w:tc>
         <w:tc>
           <w:tcPr>
-            <w:tcW w:type="dxa" w:w="6480"/>
+            <w:tcW w:type="dxa" w:w="6250"/>
           </w:tcPr>
           <w:p/>
         </w:tc>
@@ -1028,8 +1033,8 @@
         <w:tblLook w:firstColumn="1" w:firstRow="1" w:lastColumn="0" w:lastRow="0" w:noHBand="0" w:noVBand="1" w:val="04A0"/>
       </w:tblPr>
       <w:tblGrid>
-        <w:gridCol w:w="2880"/>
-        <w:gridCol w:w="6480"/>
+        <w:gridCol w:w="2779"/>
+        <w:gridCol w:w="6249"/>
       </w:tblGrid>
       <w:tr>
         <w:trPr>
@@ -1037,13 +1042,13 @@
         </w:trPr>
         <w:tc>
           <w:tcPr>
-            <w:tcW w:type="dxa" w:w="2880"/>
+            <w:tcW w:type="dxa" w:w="2779"/>
             <w:shd w:val="clear" w:color="auto" w:fill="0064E0"/>
           </w:tcPr>
           <w:p>
             <w:r>
               <w:rPr>
-                <w:b/>
+                <w:rFonts w:ascii="TWK Lausanne 550" w:hAnsi="TWK Lausanne 550"/>
                 <w:color w:val="FFFFFF"/>
               </w:rPr>
               <w:t>Integration</w:t>
@@ -1052,13 +1057,13 @@
         </w:tc>
         <w:tc>
           <w:tcPr>
-            <w:tcW w:type="dxa" w:w="6480"/>
+            <w:tcW w:type="dxa" w:w="6250"/>
             <w:shd w:val="clear" w:color="auto" w:fill="0064E0"/>
           </w:tcPr>
           <w:p>
             <w:r>
               <w:rPr>
-                <w:b/>
+                <w:rFonts w:ascii="TWK Lausanne 550" w:hAnsi="TWK Lausanne 550"/>
                 <w:color w:val="FFFFFF"/>
               </w:rPr>
               <w:t>Source, target and purpose</w:t>
@@ -1069,7 +1074,7 @@
       <w:tr>
         <w:tc>
           <w:tcPr>
-            <w:tcW w:type="dxa" w:w="2880"/>
+            <w:tcW w:type="dxa" w:w="2779"/>
           </w:tcPr>
           <w:p>
             <w:r>
@@ -1079,7 +1084,7 @@
         </w:tc>
         <w:tc>
           <w:tcPr>
-            <w:tcW w:type="dxa" w:w="6480"/>
+            <w:tcW w:type="dxa" w:w="6250"/>
           </w:tcPr>
           <w:p/>
         </w:tc>
@@ -1087,7 +1092,7 @@
       <w:tr>
         <w:tc>
           <w:tcPr>
-            <w:tcW w:type="dxa" w:w="2880"/>
+            <w:tcW w:type="dxa" w:w="2779"/>
           </w:tcPr>
           <w:p>
             <w:r>
@@ -1097,7 +1102,7 @@
         </w:tc>
         <w:tc>
           <w:tcPr>
-            <w:tcW w:type="dxa" w:w="6480"/>
+            <w:tcW w:type="dxa" w:w="6250"/>
           </w:tcPr>
           <w:p>
             <w:r>
@@ -1109,7 +1114,7 @@
       <w:tr>
         <w:tc>
           <w:tcPr>
-            <w:tcW w:type="dxa" w:w="2880"/>
+            <w:tcW w:type="dxa" w:w="2779"/>
           </w:tcPr>
           <w:p>
             <w:r>
@@ -1119,7 +1124,7 @@
         </w:tc>
         <w:tc>
           <w:tcPr>
-            <w:tcW w:type="dxa" w:w="6480"/>
+            <w:tcW w:type="dxa" w:w="6250"/>
           </w:tcPr>
           <w:p/>
         </w:tc>
@@ -1212,10 +1217,10 @@
         <w:tblLook w:firstColumn="1" w:firstRow="1" w:lastColumn="0" w:lastRow="0" w:noHBand="0" w:noVBand="1" w:val="04A0"/>
       </w:tblPr>
       <w:tblGrid>
-        <w:gridCol w:w="2015"/>
-        <w:gridCol w:w="2304"/>
-        <w:gridCol w:w="3456"/>
-        <w:gridCol w:w="1584"/>
+        <w:gridCol w:w="1944"/>
+        <w:gridCol w:w="2217"/>
+        <w:gridCol w:w="3340"/>
+        <w:gridCol w:w="1526"/>
       </w:tblGrid>
       <w:tr>
         <w:trPr>
@@ -1223,13 +1228,13 @@
         </w:trPr>
         <w:tc>
           <w:tcPr>
-            <w:tcW w:type="dxa" w:w="2016"/>
+            <w:tcW w:type="dxa" w:w="1944"/>
             <w:shd w:val="clear" w:color="auto" w:fill="0064E0"/>
           </w:tcPr>
           <w:p>
             <w:r>
               <w:rPr>
-                <w:b/>
+                <w:rFonts w:ascii="TWK Lausanne 550" w:hAnsi="TWK Lausanne 550"/>
                 <w:color w:val="FFFFFF"/>
               </w:rPr>
               <w:t>Phase</w:t>
@@ -1238,13 +1243,13 @@
         </w:tc>
         <w:tc>
           <w:tcPr>
-            <w:tcW w:type="dxa" w:w="2304"/>
+            <w:tcW w:type="dxa" w:w="2218"/>
             <w:shd w:val="clear" w:color="auto" w:fill="0064E0"/>
           </w:tcPr>
           <w:p>
             <w:r>
               <w:rPr>
-                <w:b/>
+                <w:rFonts w:ascii="TWK Lausanne 550" w:hAnsi="TWK Lausanne 550"/>
                 <w:color w:val="FFFFFF"/>
               </w:rPr>
               <w:t>Deliverable</w:t>
@@ -1253,13 +1258,13 @@
         </w:tc>
         <w:tc>
           <w:tcPr>
-            <w:tcW w:type="dxa" w:w="3456"/>
+            <w:tcW w:type="dxa" w:w="3341"/>
             <w:shd w:val="clear" w:color="auto" w:fill="0064E0"/>
           </w:tcPr>
           <w:p>
             <w:r>
               <w:rPr>
-                <w:b/>
+                <w:rFonts w:ascii="TWK Lausanne 550" w:hAnsi="TWK Lausanne 550"/>
                 <w:color w:val="FFFFFF"/>
               </w:rPr>
               <w:t>Description</w:t>
@@ -1268,13 +1273,13 @@
         </w:tc>
         <w:tc>
           <w:tcPr>
-            <w:tcW w:type="dxa" w:w="1584"/>
+            <w:tcW w:type="dxa" w:w="1526"/>
             <w:shd w:val="clear" w:color="auto" w:fill="0064E0"/>
           </w:tcPr>
           <w:p>
             <w:r>
               <w:rPr>
-                <w:b/>
+                <w:rFonts w:ascii="TWK Lausanne 550" w:hAnsi="TWK Lausanne 550"/>
                 <w:color w:val="FFFFFF"/>
               </w:rPr>
               <w:t>Format</w:t>
@@ -1285,7 +1290,7 @@
       <w:tr>
         <w:tc>
           <w:tcPr>
-            <w:tcW w:type="dxa" w:w="2016"/>
+            <w:tcW w:type="dxa" w:w="1944"/>
           </w:tcPr>
           <w:p>
             <w:r>
@@ -1295,19 +1300,19 @@
         </w:tc>
         <w:tc>
           <w:tcPr>
-            <w:tcW w:type="dxa" w:w="2304"/>
+            <w:tcW w:type="dxa" w:w="2218"/>
           </w:tcPr>
           <w:p/>
         </w:tc>
         <w:tc>
           <w:tcPr>
-            <w:tcW w:type="dxa" w:w="3456"/>
+            <w:tcW w:type="dxa" w:w="3341"/>
           </w:tcPr>
           <w:p/>
         </w:tc>
         <w:tc>
           <w:tcPr>
-            <w:tcW w:type="dxa" w:w="1584"/>
+            <w:tcW w:type="dxa" w:w="1526"/>
           </w:tcPr>
           <w:p/>
         </w:tc>
@@ -1315,7 +1320,7 @@
       <w:tr>
         <w:tc>
           <w:tcPr>
-            <w:tcW w:type="dxa" w:w="2016"/>
+            <w:tcW w:type="dxa" w:w="1944"/>
           </w:tcPr>
           <w:p>
             <w:r>
@@ -1325,7 +1330,7 @@
         </w:tc>
         <w:tc>
           <w:tcPr>
-            <w:tcW w:type="dxa" w:w="2304"/>
+            <w:tcW w:type="dxa" w:w="2218"/>
           </w:tcPr>
           <w:p>
             <w:r>
@@ -1335,7 +1340,7 @@
         </w:tc>
         <w:tc>
           <w:tcPr>
-            <w:tcW w:type="dxa" w:w="3456"/>
+            <w:tcW w:type="dxa" w:w="3341"/>
           </w:tcPr>
           <w:p>
             <w:r>
@@ -1345,7 +1350,7 @@
         </w:tc>
         <w:tc>
           <w:tcPr>
-            <w:tcW w:type="dxa" w:w="1584"/>
+            <w:tcW w:type="dxa" w:w="1526"/>
           </w:tcPr>
           <w:p>
             <w:r>
@@ -1357,7 +1362,7 @@
       <w:tr>
         <w:tc>
           <w:tcPr>
-            <w:tcW w:type="dxa" w:w="2016"/>
+            <w:tcW w:type="dxa" w:w="1944"/>
           </w:tcPr>
           <w:p>
             <w:r>
@@ -1367,19 +1372,19 @@
         </w:tc>
         <w:tc>
           <w:tcPr>
-            <w:tcW w:type="dxa" w:w="2304"/>
+            <w:tcW w:type="dxa" w:w="2218"/>
           </w:tcPr>
           <w:p/>
         </w:tc>
         <w:tc>
           <w:tcPr>
-            <w:tcW w:type="dxa" w:w="3456"/>
+            <w:tcW w:type="dxa" w:w="3341"/>
           </w:tcPr>
           <w:p/>
         </w:tc>
         <w:tc>
           <w:tcPr>
-            <w:tcW w:type="dxa" w:w="1584"/>
+            <w:tcW w:type="dxa" w:w="1526"/>
           </w:tcPr>
           <w:p/>
         </w:tc>
@@ -1528,8 +1533,8 @@
         <w:tblLook w:firstColumn="1" w:firstRow="1" w:lastColumn="0" w:lastRow="0" w:noHBand="0" w:noVBand="1" w:val="04A0"/>
       </w:tblPr>
       <w:tblGrid>
-        <w:gridCol w:w="3600"/>
-        <w:gridCol w:w="5760"/>
+        <w:gridCol w:w="3470"/>
+        <w:gridCol w:w="5558"/>
       </w:tblGrid>
       <w:tr>
         <w:trPr>
@@ -1537,13 +1542,13 @@
         </w:trPr>
         <w:tc>
           <w:tcPr>
-            <w:tcW w:type="dxa" w:w="3600"/>
+            <w:tcW w:type="dxa" w:w="3470"/>
             <w:shd w:val="clear" w:color="auto" w:fill="0064E0"/>
           </w:tcPr>
           <w:p>
             <w:r>
               <w:rPr>
-                <w:b/>
+                <w:rFonts w:ascii="TWK Lausanne 550" w:hAnsi="TWK Lausanne 550"/>
                 <w:color w:val="FFFFFF"/>
               </w:rPr>
               <w:t>Risk</w:t>
@@ -1552,13 +1557,13 @@
         </w:tc>
         <w:tc>
           <w:tcPr>
-            <w:tcW w:type="dxa" w:w="5760"/>
+            <w:tcW w:type="dxa" w:w="5558"/>
             <w:shd w:val="clear" w:color="auto" w:fill="0064E0"/>
           </w:tcPr>
           <w:p>
             <w:r>
               <w:rPr>
-                <w:b/>
+                <w:rFonts w:ascii="TWK Lausanne 550" w:hAnsi="TWK Lausanne 550"/>
                 <w:color w:val="FFFFFF"/>
               </w:rPr>
               <w:t>Mitigation</w:t>
@@ -1569,7 +1574,7 @@
       <w:tr>
         <w:tc>
           <w:tcPr>
-            <w:tcW w:type="dxa" w:w="3600"/>
+            <w:tcW w:type="dxa" w:w="3470"/>
           </w:tcPr>
           <w:p>
             <w:r>
@@ -1579,7 +1584,7 @@
         </w:tc>
         <w:tc>
           <w:tcPr>
-            <w:tcW w:type="dxa" w:w="5760"/>
+            <w:tcW w:type="dxa" w:w="5558"/>
           </w:tcPr>
           <w:p/>
         </w:tc>
@@ -1587,7 +1592,7 @@
       <w:tr>
         <w:tc>
           <w:tcPr>
-            <w:tcW w:type="dxa" w:w="3600"/>
+            <w:tcW w:type="dxa" w:w="3470"/>
           </w:tcPr>
           <w:p>
             <w:r>
@@ -1597,7 +1602,7 @@
         </w:tc>
         <w:tc>
           <w:tcPr>
-            <w:tcW w:type="dxa" w:w="5760"/>
+            <w:tcW w:type="dxa" w:w="5558"/>
           </w:tcPr>
           <w:p>
             <w:r>
@@ -1609,7 +1614,7 @@
       <w:tr>
         <w:tc>
           <w:tcPr>
-            <w:tcW w:type="dxa" w:w="3600"/>
+            <w:tcW w:type="dxa" w:w="3470"/>
           </w:tcPr>
           <w:p>
             <w:r>
@@ -1619,7 +1624,7 @@
         </w:tc>
         <w:tc>
           <w:tcPr>
-            <w:tcW w:type="dxa" w:w="5760"/>
+            <w:tcW w:type="dxa" w:w="5558"/>
           </w:tcPr>
           <w:p/>
         </w:tc>
@@ -1709,7 +1714,7 @@
     <w:p>
       <w:r>
         <w:rPr>
-          <w:b/>
+          <w:rFonts w:ascii="TWK Lausanne 550" w:hAnsi="TWK Lausanne 550"/>
         </w:rPr>
         <w:t xml:space="preserve">Start date (estimated): </w:t>
       </w:r>
@@ -1720,7 +1725,7 @@
     <w:p>
       <w:r>
         <w:rPr>
-          <w:b/>
+          <w:rFonts w:ascii="TWK Lausanne 550" w:hAnsi="TWK Lausanne 550"/>
         </w:rPr>
         <w:t xml:space="preserve">End date (estimated): </w:t>
       </w:r>
@@ -1737,9 +1742,9 @@
         <w:tblLook w:firstColumn="1" w:firstRow="1" w:lastColumn="0" w:lastRow="0" w:noHBand="0" w:noVBand="1" w:val="04A0"/>
       </w:tblPr>
       <w:tblGrid>
-        <w:gridCol w:w="2448"/>
-        <w:gridCol w:w="1728"/>
-        <w:gridCol w:w="5184"/>
+        <w:gridCol w:w="2361"/>
+        <w:gridCol w:w="1670"/>
+        <w:gridCol w:w="4996"/>
       </w:tblGrid>
       <w:tr>
         <w:trPr>
@@ -1747,13 +1752,13 @@
         </w:trPr>
         <w:tc>
           <w:tcPr>
-            <w:tcW w:type="dxa" w:w="2448"/>
+            <w:tcW w:type="dxa" w:w="2362"/>
             <w:shd w:val="clear" w:color="auto" w:fill="0064E0"/>
           </w:tcPr>
           <w:p>
             <w:r>
               <w:rPr>
-                <w:b/>
+                <w:rFonts w:ascii="TWK Lausanne 550" w:hAnsi="TWK Lausanne 550"/>
                 <w:color w:val="FFFFFF"/>
               </w:rPr>
               <w:t>Phase</w:t>
@@ -1762,13 +1767,13 @@
         </w:tc>
         <w:tc>
           <w:tcPr>
-            <w:tcW w:type="dxa" w:w="1728"/>
+            <w:tcW w:type="dxa" w:w="1670"/>
             <w:shd w:val="clear" w:color="auto" w:fill="0064E0"/>
           </w:tcPr>
           <w:p>
             <w:r>
               <w:rPr>
-                <w:b/>
+                <w:rFonts w:ascii="TWK Lausanne 550" w:hAnsi="TWK Lausanne 550"/>
                 <w:color w:val="FFFFFF"/>
               </w:rPr>
               <w:t>Period</w:t>
@@ -1777,13 +1782,13 @@
         </w:tc>
         <w:tc>
           <w:tcPr>
-            <w:tcW w:type="dxa" w:w="5184"/>
+            <w:tcW w:type="dxa" w:w="4997"/>
             <w:shd w:val="clear" w:color="auto" w:fill="0064E0"/>
           </w:tcPr>
           <w:p>
             <w:r>
               <w:rPr>
-                <w:b/>
+                <w:rFonts w:ascii="TWK Lausanne 550" w:hAnsi="TWK Lausanne 550"/>
                 <w:color w:val="FFFFFF"/>
               </w:rPr>
               <w:t>Activities and outcomes</w:t>
@@ -1794,7 +1799,7 @@
       <w:tr>
         <w:tc>
           <w:tcPr>
-            <w:tcW w:type="dxa" w:w="2448"/>
+            <w:tcW w:type="dxa" w:w="2362"/>
           </w:tcPr>
           <w:p>
             <w:r>
@@ -1804,13 +1809,13 @@
         </w:tc>
         <w:tc>
           <w:tcPr>
-            <w:tcW w:type="dxa" w:w="1728"/>
+            <w:tcW w:type="dxa" w:w="1670"/>
           </w:tcPr>
           <w:p/>
         </w:tc>
         <w:tc>
           <w:tcPr>
-            <w:tcW w:type="dxa" w:w="5184"/>
+            <w:tcW w:type="dxa" w:w="4997"/>
           </w:tcPr>
           <w:p/>
         </w:tc>
@@ -1818,7 +1823,7 @@
       <w:tr>
         <w:tc>
           <w:tcPr>
-            <w:tcW w:type="dxa" w:w="2448"/>
+            <w:tcW w:type="dxa" w:w="2362"/>
           </w:tcPr>
           <w:p>
             <w:r>
@@ -1828,7 +1833,7 @@
         </w:tc>
         <w:tc>
           <w:tcPr>
-            <w:tcW w:type="dxa" w:w="1728"/>
+            <w:tcW w:type="dxa" w:w="1670"/>
           </w:tcPr>
           <w:p>
             <w:r>
@@ -1838,7 +1843,7 @@
         </w:tc>
         <w:tc>
           <w:tcPr>
-            <w:tcW w:type="dxa" w:w="5184"/>
+            <w:tcW w:type="dxa" w:w="4997"/>
           </w:tcPr>
           <w:p>
             <w:r>
@@ -1850,7 +1855,7 @@
       <w:tr>
         <w:tc>
           <w:tcPr>
-            <w:tcW w:type="dxa" w:w="2448"/>
+            <w:tcW w:type="dxa" w:w="2362"/>
           </w:tcPr>
           <w:p>
             <w:r>
@@ -1860,13 +1865,13 @@
         </w:tc>
         <w:tc>
           <w:tcPr>
-            <w:tcW w:type="dxa" w:w="1728"/>
+            <w:tcW w:type="dxa" w:w="1670"/>
           </w:tcPr>
           <w:p/>
         </w:tc>
         <w:tc>
           <w:tcPr>
-            <w:tcW w:type="dxa" w:w="5184"/>
+            <w:tcW w:type="dxa" w:w="4997"/>
           </w:tcPr>
           <w:p/>
         </w:tc>
@@ -1895,8 +1900,8 @@
         <w:tblLook w:firstColumn="1" w:firstRow="1" w:lastColumn="0" w:lastRow="0" w:noHBand="0" w:noVBand="1" w:val="04A0"/>
       </w:tblPr>
       <w:tblGrid>
-        <w:gridCol w:w="3168"/>
-        <w:gridCol w:w="6192"/>
+        <w:gridCol w:w="3052"/>
+        <w:gridCol w:w="5976"/>
       </w:tblGrid>
       <w:tr>
         <w:trPr>
@@ -1904,13 +1909,13 @@
         </w:trPr>
         <w:tc>
           <w:tcPr>
-            <w:tcW w:type="dxa" w:w="3168"/>
+            <w:tcW w:type="dxa" w:w="3053"/>
             <w:shd w:val="clear" w:color="auto" w:fill="0064E0"/>
           </w:tcPr>
           <w:p>
             <w:r>
               <w:rPr>
-                <w:b/>
+                <w:rFonts w:ascii="TWK Lausanne 550" w:hAnsi="TWK Lausanne 550"/>
                 <w:color w:val="FFFFFF"/>
               </w:rPr>
               <w:t>Vendor role</w:t>
@@ -1919,13 +1924,13 @@
         </w:tc>
         <w:tc>
           <w:tcPr>
-            <w:tcW w:type="dxa" w:w="6192"/>
+            <w:tcW w:type="dxa" w:w="5976"/>
             <w:shd w:val="clear" w:color="auto" w:fill="0064E0"/>
           </w:tcPr>
           <w:p>
             <w:r>
               <w:rPr>
-                <w:b/>
+                <w:rFonts w:ascii="TWK Lausanne 550" w:hAnsi="TWK Lausanne 550"/>
                 <w:color w:val="FFFFFF"/>
               </w:rPr>
               <w:t>Responsibilities</w:t>
@@ -1936,7 +1941,7 @@
       <w:tr>
         <w:tc>
           <w:tcPr>
-            <w:tcW w:type="dxa" w:w="3168"/>
+            <w:tcW w:type="dxa" w:w="3053"/>
           </w:tcPr>
           <w:p>
             <w:r>
@@ -1946,7 +1951,7 @@
         </w:tc>
         <w:tc>
           <w:tcPr>
-            <w:tcW w:type="dxa" w:w="6192"/>
+            <w:tcW w:type="dxa" w:w="5976"/>
           </w:tcPr>
           <w:p/>
         </w:tc>
@@ -1954,7 +1959,7 @@
       <w:tr>
         <w:tc>
           <w:tcPr>
-            <w:tcW w:type="dxa" w:w="3168"/>
+            <w:tcW w:type="dxa" w:w="3053"/>
           </w:tcPr>
           <w:p>
             <w:r>
@@ -1964,7 +1969,7 @@
         </w:tc>
         <w:tc>
           <w:tcPr>
-            <w:tcW w:type="dxa" w:w="6192"/>
+            <w:tcW w:type="dxa" w:w="5976"/>
           </w:tcPr>
           <w:p>
             <w:r>
@@ -1976,7 +1981,7 @@
       <w:tr>
         <w:tc>
           <w:tcPr>
-            <w:tcW w:type="dxa" w:w="3168"/>
+            <w:tcW w:type="dxa" w:w="3053"/>
           </w:tcPr>
           <w:p>
             <w:r>
@@ -1986,7 +1991,7 @@
         </w:tc>
         <w:tc>
           <w:tcPr>
-            <w:tcW w:type="dxa" w:w="6192"/>
+            <w:tcW w:type="dxa" w:w="5976"/>
           </w:tcPr>
           <w:p/>
         </w:tc>
@@ -2012,8 +2017,8 @@
         <w:tblLook w:firstColumn="1" w:firstRow="1" w:lastColumn="0" w:lastRow="0" w:noHBand="0" w:noVBand="1" w:val="04A0"/>
       </w:tblPr>
       <w:tblGrid>
-        <w:gridCol w:w="3168"/>
-        <w:gridCol w:w="6192"/>
+        <w:gridCol w:w="3052"/>
+        <w:gridCol w:w="5976"/>
       </w:tblGrid>
       <w:tr>
         <w:trPr>
@@ -2021,13 +2026,13 @@
         </w:trPr>
         <w:tc>
           <w:tcPr>
-            <w:tcW w:type="dxa" w:w="3168"/>
+            <w:tcW w:type="dxa" w:w="3053"/>
             <w:shd w:val="clear" w:color="auto" w:fill="0064E0"/>
           </w:tcPr>
           <w:p>
             <w:r>
               <w:rPr>
-                <w:b/>
+                <w:rFonts w:ascii="TWK Lausanne 550" w:hAnsi="TWK Lausanne 550"/>
                 <w:color w:val="FFFFFF"/>
               </w:rPr>
               <w:t>Client role</w:t>
@@ -2036,13 +2041,13 @@
         </w:tc>
         <w:tc>
           <w:tcPr>
-            <w:tcW w:type="dxa" w:w="6192"/>
+            <w:tcW w:type="dxa" w:w="5976"/>
             <w:shd w:val="clear" w:color="auto" w:fill="0064E0"/>
           </w:tcPr>
           <w:p>
             <w:r>
               <w:rPr>
-                <w:b/>
+                <w:rFonts w:ascii="TWK Lausanne 550" w:hAnsi="TWK Lausanne 550"/>
                 <w:color w:val="FFFFFF"/>
               </w:rPr>
               <w:t>Responsibilities</w:t>
@@ -2053,7 +2058,7 @@
       <w:tr>
         <w:tc>
           <w:tcPr>
-            <w:tcW w:type="dxa" w:w="3168"/>
+            <w:tcW w:type="dxa" w:w="3053"/>
           </w:tcPr>
           <w:p>
             <w:r>
@@ -2063,7 +2068,7 @@
         </w:tc>
         <w:tc>
           <w:tcPr>
-            <w:tcW w:type="dxa" w:w="6192"/>
+            <w:tcW w:type="dxa" w:w="5976"/>
           </w:tcPr>
           <w:p/>
         </w:tc>
@@ -2071,7 +2076,7 @@
       <w:tr>
         <w:tc>
           <w:tcPr>
-            <w:tcW w:type="dxa" w:w="3168"/>
+            <w:tcW w:type="dxa" w:w="3053"/>
           </w:tcPr>
           <w:p>
             <w:r>
@@ -2081,7 +2086,7 @@
         </w:tc>
         <w:tc>
           <w:tcPr>
-            <w:tcW w:type="dxa" w:w="6192"/>
+            <w:tcW w:type="dxa" w:w="5976"/>
           </w:tcPr>
           <w:p>
             <w:r>
@@ -2093,7 +2098,7 @@
       <w:tr>
         <w:tc>
           <w:tcPr>
-            <w:tcW w:type="dxa" w:w="3168"/>
+            <w:tcW w:type="dxa" w:w="3053"/>
           </w:tcPr>
           <w:p>
             <w:r>
@@ -2103,7 +2108,7 @@
         </w:tc>
         <w:tc>
           <w:tcPr>
-            <w:tcW w:type="dxa" w:w="6192"/>
+            <w:tcW w:type="dxa" w:w="5976"/>
           </w:tcPr>
           <w:p/>
         </w:tc>
@@ -2165,11 +2170,11 @@
         <w:tblLook w:firstColumn="1" w:firstRow="1" w:lastColumn="0" w:lastRow="0" w:noHBand="0" w:noVBand="1" w:val="04A0"/>
       </w:tblPr>
       <w:tblGrid>
-        <w:gridCol w:w="2304"/>
-        <w:gridCol w:w="2880"/>
-        <w:gridCol w:w="864"/>
-        <w:gridCol w:w="1655"/>
-        <w:gridCol w:w="1655"/>
+        <w:gridCol w:w="2217"/>
+        <w:gridCol w:w="2779"/>
+        <w:gridCol w:w="835"/>
+        <w:gridCol w:w="1598"/>
+        <w:gridCol w:w="1598"/>
       </w:tblGrid>
       <w:tr>
         <w:trPr>
@@ -2177,13 +2182,13 @@
         </w:trPr>
         <w:tc>
           <w:tcPr>
-            <w:tcW w:type="dxa" w:w="2304"/>
+            <w:tcW w:type="dxa" w:w="2218"/>
             <w:shd w:val="clear" w:color="auto" w:fill="0064E0"/>
           </w:tcPr>
           <w:p>
             <w:r>
               <w:rPr>
-                <w:b/>
+                <w:rFonts w:ascii="TWK Lausanne 550" w:hAnsi="TWK Lausanne 550"/>
                 <w:color w:val="FFFFFF"/>
               </w:rPr>
               <w:t>Item</w:t>
@@ -2192,13 +2197,13 @@
         </w:tc>
         <w:tc>
           <w:tcPr>
-            <w:tcW w:type="dxa" w:w="2880"/>
+            <w:tcW w:type="dxa" w:w="2779"/>
             <w:shd w:val="clear" w:color="auto" w:fill="0064E0"/>
           </w:tcPr>
           <w:p>
             <w:r>
               <w:rPr>
-                <w:b/>
+                <w:rFonts w:ascii="TWK Lausanne 550" w:hAnsi="TWK Lausanne 550"/>
                 <w:color w:val="FFFFFF"/>
               </w:rPr>
               <w:t>Description</w:t>
@@ -2207,13 +2212,13 @@
         </w:tc>
         <w:tc>
           <w:tcPr>
-            <w:tcW w:type="dxa" w:w="864"/>
+            <w:tcW w:type="dxa" w:w="835"/>
             <w:shd w:val="clear" w:color="auto" w:fill="0064E0"/>
           </w:tcPr>
           <w:p>
             <w:r>
               <w:rPr>
-                <w:b/>
+                <w:rFonts w:ascii="TWK Lausanne 550" w:hAnsi="TWK Lausanne 550"/>
                 <w:color w:val="FFFFFF"/>
               </w:rPr>
               <w:t>Qty</w:t>
@@ -2222,13 +2227,13 @@
         </w:tc>
         <w:tc>
           <w:tcPr>
-            <w:tcW w:type="dxa" w:w="1656"/>
+            <w:tcW w:type="dxa" w:w="1598"/>
             <w:shd w:val="clear" w:color="auto" w:fill="0064E0"/>
           </w:tcPr>
           <w:p>
             <w:r>
               <w:rPr>
-                <w:b/>
+                <w:rFonts w:ascii="TWK Lausanne 550" w:hAnsi="TWK Lausanne 550"/>
                 <w:color w:val="FFFFFF"/>
               </w:rPr>
               <w:t>Unit price</w:t>
@@ -2237,13 +2242,13 @@
         </w:tc>
         <w:tc>
           <w:tcPr>
-            <w:tcW w:type="dxa" w:w="1656"/>
+            <w:tcW w:type="dxa" w:w="1598"/>
             <w:shd w:val="clear" w:color="auto" w:fill="0064E0"/>
           </w:tcPr>
           <w:p>
             <w:r>
               <w:rPr>
-                <w:b/>
+                <w:rFonts w:ascii="TWK Lausanne 550" w:hAnsi="TWK Lausanne 550"/>
                 <w:color w:val="FFFFFF"/>
               </w:rPr>
               <w:t>Amount</w:t>
@@ -2254,7 +2259,7 @@
       <w:tr>
         <w:tc>
           <w:tcPr>
-            <w:tcW w:type="dxa" w:w="2304"/>
+            <w:tcW w:type="dxa" w:w="2218"/>
           </w:tcPr>
           <w:p>
             <w:r>
@@ -2264,25 +2269,25 @@
         </w:tc>
         <w:tc>
           <w:tcPr>
-            <w:tcW w:type="dxa" w:w="2880"/>
+            <w:tcW w:type="dxa" w:w="2779"/>
           </w:tcPr>
           <w:p/>
         </w:tc>
         <w:tc>
           <w:tcPr>
-            <w:tcW w:type="dxa" w:w="864"/>
+            <w:tcW w:type="dxa" w:w="835"/>
           </w:tcPr>
           <w:p/>
         </w:tc>
         <w:tc>
           <w:tcPr>
-            <w:tcW w:type="dxa" w:w="1656"/>
+            <w:tcW w:type="dxa" w:w="1598"/>
           </w:tcPr>
           <w:p/>
         </w:tc>
         <w:tc>
           <w:tcPr>
-            <w:tcW w:type="dxa" w:w="1656"/>
+            <w:tcW w:type="dxa" w:w="1598"/>
           </w:tcPr>
           <w:p/>
         </w:tc>
@@ -2290,7 +2295,7 @@
       <w:tr>
         <w:tc>
           <w:tcPr>
-            <w:tcW w:type="dxa" w:w="2304"/>
+            <w:tcW w:type="dxa" w:w="2218"/>
           </w:tcPr>
           <w:p>
             <w:r>
@@ -2300,7 +2305,7 @@
         </w:tc>
         <w:tc>
           <w:tcPr>
-            <w:tcW w:type="dxa" w:w="2880"/>
+            <w:tcW w:type="dxa" w:w="2779"/>
           </w:tcPr>
           <w:p>
             <w:r>
@@ -2310,7 +2315,7 @@
         </w:tc>
         <w:tc>
           <w:tcPr>
-            <w:tcW w:type="dxa" w:w="864"/>
+            <w:tcW w:type="dxa" w:w="835"/>
           </w:tcPr>
           <w:p>
             <w:r>
@@ -2320,7 +2325,7 @@
         </w:tc>
         <w:tc>
           <w:tcPr>
-            <w:tcW w:type="dxa" w:w="1656"/>
+            <w:tcW w:type="dxa" w:w="1598"/>
           </w:tcPr>
           <w:p>
             <w:r>
@@ -2330,7 +2335,7 @@
         </w:tc>
         <w:tc>
           <w:tcPr>
-            <w:tcW w:type="dxa" w:w="1656"/>
+            <w:tcW w:type="dxa" w:w="1598"/>
           </w:tcPr>
           <w:p>
             <w:r>
@@ -2342,7 +2347,7 @@
       <w:tr>
         <w:tc>
           <w:tcPr>
-            <w:tcW w:type="dxa" w:w="2304"/>
+            <w:tcW w:type="dxa" w:w="2218"/>
           </w:tcPr>
           <w:p>
             <w:r>
@@ -2352,25 +2357,25 @@
         </w:tc>
         <w:tc>
           <w:tcPr>
-            <w:tcW w:type="dxa" w:w="2880"/>
+            <w:tcW w:type="dxa" w:w="2779"/>
           </w:tcPr>
           <w:p/>
         </w:tc>
         <w:tc>
           <w:tcPr>
-            <w:tcW w:type="dxa" w:w="864"/>
+            <w:tcW w:type="dxa" w:w="835"/>
           </w:tcPr>
           <w:p/>
         </w:tc>
         <w:tc>
           <w:tcPr>
-            <w:tcW w:type="dxa" w:w="1656"/>
+            <w:tcW w:type="dxa" w:w="1598"/>
           </w:tcPr>
           <w:p/>
         </w:tc>
         <w:tc>
           <w:tcPr>
-            <w:tcW w:type="dxa" w:w="1656"/>
+            <w:tcW w:type="dxa" w:w="1598"/>
           </w:tcPr>
           <w:p/>
         </w:tc>
@@ -2378,12 +2383,12 @@
       <w:tr>
         <w:tc>
           <w:tcPr>
-            <w:tcW w:type="dxa" w:w="2304"/>
+            <w:tcW w:type="dxa" w:w="2218"/>
           </w:tcPr>
           <w:p>
             <w:r>
               <w:rPr>
-                <w:b/>
+                <w:rFonts w:ascii="TWK Lausanne 550" w:hAnsi="TWK Lausanne 550"/>
               </w:rPr>
               <w:t>{% if fees %}Subtotal{% else %}Total cost{% endif %}</w:t>
             </w:r>
@@ -2391,48 +2396,48 @@
         </w:tc>
         <w:tc>
           <w:tcPr>
-            <w:tcW w:type="dxa" w:w="2880"/>
+            <w:tcW w:type="dxa" w:w="2779"/>
           </w:tcPr>
           <w:p>
             <w:r>
               <w:rPr>
-                <w:b/>
+                <w:rFonts w:ascii="TWK Lausanne 550" w:hAnsi="TWK Lausanne 550"/>
               </w:rPr>
             </w:r>
           </w:p>
         </w:tc>
         <w:tc>
           <w:tcPr>
-            <w:tcW w:type="dxa" w:w="864"/>
+            <w:tcW w:type="dxa" w:w="835"/>
           </w:tcPr>
           <w:p>
             <w:r>
               <w:rPr>
-                <w:b/>
+                <w:rFonts w:ascii="TWK Lausanne 550" w:hAnsi="TWK Lausanne 550"/>
               </w:rPr>
             </w:r>
           </w:p>
         </w:tc>
         <w:tc>
           <w:tcPr>
-            <w:tcW w:type="dxa" w:w="1656"/>
+            <w:tcW w:type="dxa" w:w="1598"/>
           </w:tcPr>
           <w:p>
             <w:r>
               <w:rPr>
-                <w:b/>
+                <w:rFonts w:ascii="TWK Lausanne 550" w:hAnsi="TWK Lausanne 550"/>
               </w:rPr>
             </w:r>
           </w:p>
         </w:tc>
         <w:tc>
           <w:tcPr>
-            <w:tcW w:type="dxa" w:w="1656"/>
+            <w:tcW w:type="dxa" w:w="1598"/>
           </w:tcPr>
           <w:p>
             <w:r>
               <w:rPr>
-                <w:b/>
+                <w:rFonts w:ascii="TWK Lausanne 550" w:hAnsi="TWK Lausanne 550"/>
               </w:rPr>
               <w:t>{{ subtotal }}</w:t>
             </w:r>
@@ -2460,10 +2465,10 @@
         <w:tblLook w:firstColumn="1" w:firstRow="1" w:lastColumn="0" w:lastRow="0" w:noHBand="0" w:noVBand="1" w:val="04A0"/>
       </w:tblPr>
       <w:tblGrid>
-        <w:gridCol w:w="3744"/>
-        <w:gridCol w:w="1440"/>
-        <w:gridCol w:w="2015"/>
-        <w:gridCol w:w="2160"/>
+        <w:gridCol w:w="3614"/>
+        <w:gridCol w:w="1382"/>
+        <w:gridCol w:w="1944"/>
+        <w:gridCol w:w="2088"/>
       </w:tblGrid>
       <w:tr>
         <w:trPr>
@@ -2471,13 +2476,13 @@
         </w:trPr>
         <w:tc>
           <w:tcPr>
-            <w:tcW w:type="dxa" w:w="3744"/>
+            <w:tcW w:type="dxa" w:w="3614"/>
             <w:shd w:val="clear" w:color="auto" w:fill="0064E0"/>
           </w:tcPr>
           <w:p>
             <w:r>
               <w:rPr>
-                <w:b/>
+                <w:rFonts w:ascii="TWK Lausanne 550" w:hAnsi="TWK Lausanne 550"/>
                 <w:color w:val="FFFFFF"/>
               </w:rPr>
               <w:t>Role</w:t>
@@ -2486,13 +2491,13 @@
         </w:tc>
         <w:tc>
           <w:tcPr>
-            <w:tcW w:type="dxa" w:w="1440"/>
+            <w:tcW w:type="dxa" w:w="1382"/>
             <w:shd w:val="clear" w:color="auto" w:fill="0064E0"/>
           </w:tcPr>
           <w:p>
             <w:r>
               <w:rPr>
-                <w:b/>
+                <w:rFonts w:ascii="TWK Lausanne 550" w:hAnsi="TWK Lausanne 550"/>
                 <w:color w:val="FFFFFF"/>
               </w:rPr>
               <w:t>Mandays</w:t>
@@ -2501,13 +2506,13 @@
         </w:tc>
         <w:tc>
           <w:tcPr>
-            <w:tcW w:type="dxa" w:w="2016"/>
+            <w:tcW w:type="dxa" w:w="1944"/>
             <w:shd w:val="clear" w:color="auto" w:fill="0064E0"/>
           </w:tcPr>
           <w:p>
             <w:r>
               <w:rPr>
-                <w:b/>
+                <w:rFonts w:ascii="TWK Lausanne 550" w:hAnsi="TWK Lausanne 550"/>
                 <w:color w:val="FFFFFF"/>
               </w:rPr>
               <w:t>Day rate</w:t>
@@ -2516,13 +2521,13 @@
         </w:tc>
         <w:tc>
           <w:tcPr>
-            <w:tcW w:type="dxa" w:w="2160"/>
+            <w:tcW w:type="dxa" w:w="2088"/>
             <w:shd w:val="clear" w:color="auto" w:fill="0064E0"/>
           </w:tcPr>
           <w:p>
             <w:r>
               <w:rPr>
-                <w:b/>
+                <w:rFonts w:ascii="TWK Lausanne 550" w:hAnsi="TWK Lausanne 550"/>
                 <w:color w:val="FFFFFF"/>
               </w:rPr>
               <w:t>Amount</w:t>
@@ -2533,7 +2538,7 @@
       <w:tr>
         <w:tc>
           <w:tcPr>
-            <w:tcW w:type="dxa" w:w="3744"/>
+            <w:tcW w:type="dxa" w:w="3614"/>
           </w:tcPr>
           <w:p>
             <w:r>
@@ -2543,19 +2548,19 @@
         </w:tc>
         <w:tc>
           <w:tcPr>
-            <w:tcW w:type="dxa" w:w="1440"/>
+            <w:tcW w:type="dxa" w:w="1382"/>
           </w:tcPr>
           <w:p/>
         </w:tc>
         <w:tc>
           <w:tcPr>
-            <w:tcW w:type="dxa" w:w="2016"/>
+            <w:tcW w:type="dxa" w:w="1944"/>
           </w:tcPr>
           <w:p/>
         </w:tc>
         <w:tc>
           <w:tcPr>
-            <w:tcW w:type="dxa" w:w="2160"/>
+            <w:tcW w:type="dxa" w:w="2088"/>
           </w:tcPr>
           <w:p/>
         </w:tc>
@@ -2563,7 +2568,7 @@
       <w:tr>
         <w:tc>
           <w:tcPr>
-            <w:tcW w:type="dxa" w:w="3744"/>
+            <w:tcW w:type="dxa" w:w="3614"/>
           </w:tcPr>
           <w:p>
             <w:r>
@@ -2573,7 +2578,7 @@
         </w:tc>
         <w:tc>
           <w:tcPr>
-            <w:tcW w:type="dxa" w:w="1440"/>
+            <w:tcW w:type="dxa" w:w="1382"/>
           </w:tcPr>
           <w:p>
             <w:r>
@@ -2583,7 +2588,7 @@
         </w:tc>
         <w:tc>
           <w:tcPr>
-            <w:tcW w:type="dxa" w:w="2016"/>
+            <w:tcW w:type="dxa" w:w="1944"/>
           </w:tcPr>
           <w:p>
             <w:r>
@@ -2593,7 +2598,7 @@
         </w:tc>
         <w:tc>
           <w:tcPr>
-            <w:tcW w:type="dxa" w:w="2160"/>
+            <w:tcW w:type="dxa" w:w="2088"/>
           </w:tcPr>
           <w:p>
             <w:r>
@@ -2605,7 +2610,7 @@
       <w:tr>
         <w:tc>
           <w:tcPr>
-            <w:tcW w:type="dxa" w:w="3744"/>
+            <w:tcW w:type="dxa" w:w="3614"/>
           </w:tcPr>
           <w:p>
             <w:r>
@@ -2615,19 +2620,19 @@
         </w:tc>
         <w:tc>
           <w:tcPr>
-            <w:tcW w:type="dxa" w:w="1440"/>
+            <w:tcW w:type="dxa" w:w="1382"/>
           </w:tcPr>
           <w:p/>
         </w:tc>
         <w:tc>
           <w:tcPr>
-            <w:tcW w:type="dxa" w:w="2016"/>
+            <w:tcW w:type="dxa" w:w="1944"/>
           </w:tcPr>
           <w:p/>
         </w:tc>
         <w:tc>
           <w:tcPr>
-            <w:tcW w:type="dxa" w:w="2160"/>
+            <w:tcW w:type="dxa" w:w="2088"/>
           </w:tcPr>
           <w:p/>
         </w:tc>
@@ -2635,12 +2640,12 @@
       <w:tr>
         <w:tc>
           <w:tcPr>
-            <w:tcW w:type="dxa" w:w="3744"/>
+            <w:tcW w:type="dxa" w:w="3614"/>
           </w:tcPr>
           <w:p>
             <w:r>
               <w:rPr>
-                <w:b/>
+                <w:rFonts w:ascii="TWK Lausanne 550" w:hAnsi="TWK Lausanne 550"/>
               </w:rPr>
               <w:t>{% if fees %}Subtotal{% else %}Total cost{% endif %}</w:t>
             </w:r>
@@ -2648,12 +2653,12 @@
         </w:tc>
         <w:tc>
           <w:tcPr>
-            <w:tcW w:type="dxa" w:w="1440"/>
+            <w:tcW w:type="dxa" w:w="1382"/>
           </w:tcPr>
           <w:p>
             <w:r>
               <w:rPr>
-                <w:b/>
+                <w:rFonts w:ascii="TWK Lausanne 550" w:hAnsi="TWK Lausanne 550"/>
               </w:rPr>
               <w:t>{{ total_mandays }}</w:t>
             </w:r>
@@ -2661,24 +2666,24 @@
         </w:tc>
         <w:tc>
           <w:tcPr>
-            <w:tcW w:type="dxa" w:w="2016"/>
+            <w:tcW w:type="dxa" w:w="1944"/>
           </w:tcPr>
           <w:p>
             <w:r>
               <w:rPr>
-                <w:b/>
+                <w:rFonts w:ascii="TWK Lausanne 550" w:hAnsi="TWK Lausanne 550"/>
               </w:rPr>
             </w:r>
           </w:p>
         </w:tc>
         <w:tc>
           <w:tcPr>
-            <w:tcW w:type="dxa" w:w="2160"/>
+            <w:tcW w:type="dxa" w:w="2088"/>
           </w:tcPr>
           <w:p>
             <w:r>
               <w:rPr>
-                <w:b/>
+                <w:rFonts w:ascii="TWK Lausanne 550" w:hAnsi="TWK Lausanne 550"/>
               </w:rPr>
               <w:t>{{ subtotal }}</w:t>
             </w:r>
@@ -2711,8 +2716,8 @@
         <w:tblLook w:firstColumn="1" w:firstRow="1" w:lastColumn="0" w:lastRow="0" w:noHBand="0" w:noVBand="1" w:val="04A0"/>
       </w:tblPr>
       <w:tblGrid>
-        <w:gridCol w:w="7200"/>
-        <w:gridCol w:w="2160"/>
+        <w:gridCol w:w="6940"/>
+        <w:gridCol w:w="2088"/>
       </w:tblGrid>
       <w:tr>
         <w:trPr>
@@ -2720,13 +2725,13 @@
         </w:trPr>
         <w:tc>
           <w:tcPr>
-            <w:tcW w:type="dxa" w:w="7200"/>
+            <w:tcW w:type="dxa" w:w="6941"/>
             <w:shd w:val="clear" w:color="auto" w:fill="0064E0"/>
           </w:tcPr>
           <w:p>
             <w:r>
               <w:rPr>
-                <w:b/>
+                <w:rFonts w:ascii="TWK Lausanne 550" w:hAnsi="TWK Lausanne 550"/>
                 <w:color w:val="FFFFFF"/>
               </w:rPr>
               <w:t>Item</w:t>
@@ -2735,13 +2740,13 @@
         </w:tc>
         <w:tc>
           <w:tcPr>
-            <w:tcW w:type="dxa" w:w="2160"/>
+            <w:tcW w:type="dxa" w:w="2088"/>
             <w:shd w:val="clear" w:color="auto" w:fill="0064E0"/>
           </w:tcPr>
           <w:p>
             <w:r>
               <w:rPr>
-                <w:b/>
+                <w:rFonts w:ascii="TWK Lausanne 550" w:hAnsi="TWK Lausanne 550"/>
                 <w:color w:val="FFFFFF"/>
               </w:rPr>
               <w:t>Amount</w:t>
@@ -2752,7 +2757,7 @@
       <w:tr>
         <w:tc>
           <w:tcPr>
-            <w:tcW w:type="dxa" w:w="7200"/>
+            <w:tcW w:type="dxa" w:w="6941"/>
           </w:tcPr>
           <w:p>
             <w:r>
@@ -2762,7 +2767,7 @@
         </w:tc>
         <w:tc>
           <w:tcPr>
-            <w:tcW w:type="dxa" w:w="2160"/>
+            <w:tcW w:type="dxa" w:w="2088"/>
           </w:tcPr>
           <w:p/>
         </w:tc>
@@ -2770,7 +2775,7 @@
       <w:tr>
         <w:tc>
           <w:tcPr>
-            <w:tcW w:type="dxa" w:w="7200"/>
+            <w:tcW w:type="dxa" w:w="6941"/>
           </w:tcPr>
           <w:p>
             <w:r>
@@ -2780,7 +2785,7 @@
         </w:tc>
         <w:tc>
           <w:tcPr>
-            <w:tcW w:type="dxa" w:w="2160"/>
+            <w:tcW w:type="dxa" w:w="2088"/>
           </w:tcPr>
           <w:p>
             <w:r>
@@ -2792,7 +2797,7 @@
       <w:tr>
         <w:tc>
           <w:tcPr>
-            <w:tcW w:type="dxa" w:w="7200"/>
+            <w:tcW w:type="dxa" w:w="6941"/>
           </w:tcPr>
           <w:p>
             <w:r>
@@ -2802,7 +2807,7 @@
         </w:tc>
         <w:tc>
           <w:tcPr>
-            <w:tcW w:type="dxa" w:w="2160"/>
+            <w:tcW w:type="dxa" w:w="2088"/>
           </w:tcPr>
           <w:p/>
         </w:tc>
@@ -2810,12 +2815,12 @@
       <w:tr>
         <w:tc>
           <w:tcPr>
-            <w:tcW w:type="dxa" w:w="7200"/>
+            <w:tcW w:type="dxa" w:w="6941"/>
           </w:tcPr>
           <w:p>
             <w:r>
               <w:rPr>
-                <w:b/>
+                <w:rFonts w:ascii="TWK Lausanne 550" w:hAnsi="TWK Lausanne 550"/>
               </w:rPr>
               <w:t>Total cost</w:t>
             </w:r>
@@ -2823,12 +2828,12 @@
         </w:tc>
         <w:tc>
           <w:tcPr>
-            <w:tcW w:type="dxa" w:w="2160"/>
+            <w:tcW w:type="dxa" w:w="2088"/>
           </w:tcPr>
           <w:p>
             <w:r>
               <w:rPr>
-                <w:b/>
+                <w:rFonts w:ascii="TWK Lausanne 550" w:hAnsi="TWK Lausanne 550"/>
               </w:rPr>
               <w:t>{{ total_fees }}</w:t>
             </w:r>
@@ -2856,10 +2861,10 @@
         <w:tblLook w:firstColumn="1" w:firstRow="1" w:lastColumn="0" w:lastRow="0" w:noHBand="0" w:noVBand="1" w:val="04A0"/>
       </w:tblPr>
       <w:tblGrid>
-        <w:gridCol w:w="2160"/>
-        <w:gridCol w:w="3456"/>
-        <w:gridCol w:w="1872"/>
-        <w:gridCol w:w="1872"/>
+        <w:gridCol w:w="2088"/>
+        <w:gridCol w:w="3340"/>
+        <w:gridCol w:w="1800"/>
+        <w:gridCol w:w="1800"/>
       </w:tblGrid>
       <w:tr>
         <w:trPr>
@@ -2867,13 +2872,13 @@
         </w:trPr>
         <w:tc>
           <w:tcPr>
-            <w:tcW w:type="dxa" w:w="2160"/>
+            <w:tcW w:type="dxa" w:w="2088"/>
             <w:shd w:val="clear" w:color="auto" w:fill="0064E0"/>
           </w:tcPr>
           <w:p>
             <w:r>
               <w:rPr>
-                <w:b/>
+                <w:rFonts w:ascii="TWK Lausanne 550" w:hAnsi="TWK Lausanne 550"/>
                 <w:color w:val="FFFFFF"/>
               </w:rPr>
               <w:t>Milestone</w:t>
@@ -2882,13 +2887,13 @@
         </w:tc>
         <w:tc>
           <w:tcPr>
-            <w:tcW w:type="dxa" w:w="3456"/>
+            <w:tcW w:type="dxa" w:w="3341"/>
             <w:shd w:val="clear" w:color="auto" w:fill="0064E0"/>
           </w:tcPr>
           <w:p>
             <w:r>
               <w:rPr>
-                <w:b/>
+                <w:rFonts w:ascii="TWK Lausanne 550" w:hAnsi="TWK Lausanne 550"/>
                 <w:color w:val="FFFFFF"/>
               </w:rPr>
               <w:t>Deliverable(s)</w:t>
@@ -2897,13 +2902,13 @@
         </w:tc>
         <w:tc>
           <w:tcPr>
-            <w:tcW w:type="dxa" w:w="1872"/>
+            <w:tcW w:type="dxa" w:w="1800"/>
             <w:shd w:val="clear" w:color="auto" w:fill="0064E0"/>
           </w:tcPr>
           <w:p>
             <w:r>
               <w:rPr>
-                <w:b/>
+                <w:rFonts w:ascii="TWK Lausanne 550" w:hAnsi="TWK Lausanne 550"/>
                 <w:color w:val="FFFFFF"/>
               </w:rPr>
               <w:t>Estimated completion</w:t>
@@ -2912,13 +2917,13 @@
         </w:tc>
         <w:tc>
           <w:tcPr>
-            <w:tcW w:type="dxa" w:w="1872"/>
+            <w:tcW w:type="dxa" w:w="1800"/>
             <w:shd w:val="clear" w:color="auto" w:fill="0064E0"/>
           </w:tcPr>
           <w:p>
             <w:r>
               <w:rPr>
-                <w:b/>
+                <w:rFonts w:ascii="TWK Lausanne 550" w:hAnsi="TWK Lausanne 550"/>
                 <w:color w:val="FFFFFF"/>
               </w:rPr>
               <w:t>Payment</w:t>
@@ -2929,7 +2934,7 @@
       <w:tr>
         <w:tc>
           <w:tcPr>
-            <w:tcW w:type="dxa" w:w="2160"/>
+            <w:tcW w:type="dxa" w:w="2088"/>
           </w:tcPr>
           <w:p>
             <w:r>
@@ -2939,19 +2944,19 @@
         </w:tc>
         <w:tc>
           <w:tcPr>
-            <w:tcW w:type="dxa" w:w="3456"/>
+            <w:tcW w:type="dxa" w:w="3341"/>
           </w:tcPr>
           <w:p/>
         </w:tc>
         <w:tc>
           <w:tcPr>
-            <w:tcW w:type="dxa" w:w="1872"/>
+            <w:tcW w:type="dxa" w:w="1800"/>
           </w:tcPr>
           <w:p/>
         </w:tc>
         <w:tc>
           <w:tcPr>
-            <w:tcW w:type="dxa" w:w="1872"/>
+            <w:tcW w:type="dxa" w:w="1800"/>
           </w:tcPr>
           <w:p/>
         </w:tc>
@@ -2959,7 +2964,7 @@
       <w:tr>
         <w:tc>
           <w:tcPr>
-            <w:tcW w:type="dxa" w:w="2160"/>
+            <w:tcW w:type="dxa" w:w="2088"/>
           </w:tcPr>
           <w:p>
             <w:r>
@@ -2969,7 +2974,7 @@
         </w:tc>
         <w:tc>
           <w:tcPr>
-            <w:tcW w:type="dxa" w:w="3456"/>
+            <w:tcW w:type="dxa" w:w="3341"/>
           </w:tcPr>
           <w:p>
             <w:r>
@@ -2979,7 +2984,7 @@
         </w:tc>
         <w:tc>
           <w:tcPr>
-            <w:tcW w:type="dxa" w:w="1872"/>
+            <w:tcW w:type="dxa" w:w="1800"/>
           </w:tcPr>
           <w:p>
             <w:r>
@@ -2989,7 +2994,7 @@
         </w:tc>
         <w:tc>
           <w:tcPr>
-            <w:tcW w:type="dxa" w:w="1872"/>
+            <w:tcW w:type="dxa" w:w="1800"/>
           </w:tcPr>
           <w:p>
             <w:r>
@@ -3001,7 +3006,7 @@
       <w:tr>
         <w:tc>
           <w:tcPr>
-            <w:tcW w:type="dxa" w:w="2160"/>
+            <w:tcW w:type="dxa" w:w="2088"/>
           </w:tcPr>
           <w:p>
             <w:r>
@@ -3011,19 +3016,19 @@
         </w:tc>
         <w:tc>
           <w:tcPr>
-            <w:tcW w:type="dxa" w:w="3456"/>
+            <w:tcW w:type="dxa" w:w="3341"/>
           </w:tcPr>
           <w:p/>
         </w:tc>
         <w:tc>
           <w:tcPr>
-            <w:tcW w:type="dxa" w:w="1872"/>
+            <w:tcW w:type="dxa" w:w="1800"/>
           </w:tcPr>
           <w:p/>
         </w:tc>
         <w:tc>
           <w:tcPr>
-            <w:tcW w:type="dxa" w:w="1872"/>
+            <w:tcW w:type="dxa" w:w="1800"/>
           </w:tcPr>
           <w:p/>
         </w:tc>
@@ -3083,19 +3088,19 @@
         <w:tblLook w:firstColumn="1" w:firstRow="1" w:lastColumn="0" w:lastRow="0" w:noHBand="0" w:noVBand="1" w:val="04A0"/>
       </w:tblPr>
       <w:tblGrid>
-        <w:gridCol w:w="4680"/>
-        <w:gridCol w:w="4680"/>
+        <w:gridCol w:w="4507"/>
+        <w:gridCol w:w="4507"/>
       </w:tblGrid>
       <w:tr>
         <w:tc>
           <w:tcPr>
-            <w:tcW w:type="dxa" w:w="4680"/>
+            <w:tcW w:type="dxa" w:w="4507"/>
             <w:shd w:val="clear" w:color="auto" w:fill="0064E0"/>
           </w:tcPr>
           <w:p>
             <w:r>
               <w:rPr>
-                <w:b/>
+                <w:rFonts w:ascii="TWK Lausanne 550" w:hAnsi="TWK Lausanne 550"/>
                 <w:color w:val="FFFFFF"/>
               </w:rPr>
               <w:t>For {{ client_name }}</w:t>
@@ -3104,13 +3109,13 @@
         </w:tc>
         <w:tc>
           <w:tcPr>
-            <w:tcW w:type="dxa" w:w="4680"/>
+            <w:tcW w:type="dxa" w:w="4507"/>
             <w:shd w:val="clear" w:color="auto" w:fill="0064E0"/>
           </w:tcPr>
           <w:p>
             <w:r>
               <w:rPr>
-                <w:b/>
+                <w:rFonts w:ascii="TWK Lausanne 550" w:hAnsi="TWK Lausanne 550"/>
                 <w:color w:val="FFFFFF"/>
               </w:rPr>
               <w:t>For {{ vendor_name }}</w:t>
@@ -3121,7 +3126,7 @@
       <w:tr>
         <w:tc>
           <w:tcPr>
-            <w:tcW w:type="dxa" w:w="4680"/>
+            <w:tcW w:type="dxa" w:w="4507"/>
           </w:tcPr>
           <w:p>
             <w:r>
@@ -3131,7 +3136,7 @@
         </w:tc>
         <w:tc>
           <w:tcPr>
-            <w:tcW w:type="dxa" w:w="4680"/>
+            <w:tcW w:type="dxa" w:w="4507"/>
           </w:tcPr>
           <w:p>
             <w:r>
@@ -3143,7 +3148,7 @@
       <w:tr>
         <w:tc>
           <w:tcPr>
-            <w:tcW w:type="dxa" w:w="4680"/>
+            <w:tcW w:type="dxa" w:w="4507"/>
           </w:tcPr>
           <w:p>
             <w:r>
@@ -3153,7 +3158,7 @@
         </w:tc>
         <w:tc>
           <w:tcPr>
-            <w:tcW w:type="dxa" w:w="4680"/>
+            <w:tcW w:type="dxa" w:w="4507"/>
           </w:tcPr>
           <w:p>
             <w:r>
@@ -3165,7 +3170,7 @@
       <w:tr>
         <w:tc>
           <w:tcPr>
-            <w:tcW w:type="dxa" w:w="4680"/>
+            <w:tcW w:type="dxa" w:w="4507"/>
           </w:tcPr>
           <w:p>
             <w:r>
@@ -3177,7 +3182,7 @@
         </w:tc>
         <w:tc>
           <w:tcPr>
-            <w:tcW w:type="dxa" w:w="4680"/>
+            <w:tcW w:type="dxa" w:w="4507"/>
           </w:tcPr>
           <w:p>
             <w:r>
@@ -3191,7 +3196,7 @@
       <w:tr>
         <w:tc>
           <w:tcPr>
-            <w:tcW w:type="dxa" w:w="4680"/>
+            <w:tcW w:type="dxa" w:w="4507"/>
           </w:tcPr>
           <w:p>
             <w:r>
@@ -3201,7 +3206,7 @@
         </w:tc>
         <w:tc>
           <w:tcPr>
-            <w:tcW w:type="dxa" w:w="4680"/>
+            <w:tcW w:type="dxa" w:w="4507"/>
           </w:tcPr>
           <w:p>
             <w:r>
@@ -3215,7 +3220,7 @@
       <w:headerReference w:type="first" r:id="rId9"/>
       <w:headerReference w:type="default" r:id="rId10"/>
       <w:footerReference w:type="default" r:id="rId11"/>
-      <w:pgSz w:w="12240" w:h="15840"/>
+      <w:pgSz w:w="11906" w:h="16838"/>
       <w:pgMar w:top="1440" w:right="1440" w:bottom="1440" w:left="1440" w:header="648" w:footer="648" w:gutter="0"/>
       <w:cols w:space="720"/>
       <w:titlePg/>
@@ -3783,9 +3788,9 @@
       <w:spacing w:after="120" w:line="276" w:lineRule="auto"/>
     </w:pPr>
     <w:rPr>
-      <w:rFonts w:ascii="Arial" w:hAnsi="Arial" w:eastAsia="Arial"/>
+      <w:rFonts w:ascii="TWK Lausanne 300" w:hAnsi="TWK Lausanne 300" w:eastAsia="TWK Lausanne 300"/>
       <w:color w:val="1C2B33"/>
-      <w:sz w:val="21"/>
+      <w:sz w:val="22"/>
     </w:rPr>
   </w:style>
   <w:style w:type="paragraph" w:styleId="Header">
@@ -3847,11 +3852,11 @@
       <w:outlineLvl w:val="0"/>
     </w:pPr>
     <w:rPr>
-      <w:rFonts w:ascii="Arial" w:hAnsi="Arial"/>
-      <w:b/>
+      <w:rFonts w:ascii="TWK Everett Bold" w:hAnsi="TWK Everett Bold"/>
+      <w:b w:val="0"/>
       <w:bCs/>
       <w:color w:val="0064E0"/>
-      <w:sz w:val="36"/>
+      <w:sz w:val="38"/>
       <w:szCs w:val="28"/>
     </w:rPr>
   </w:style>
@@ -3871,11 +3876,11 @@
       <w:outlineLvl w:val="1"/>
     </w:pPr>
     <w:rPr>
-      <w:rFonts w:ascii="Arial" w:hAnsi="Arial"/>
-      <w:b/>
+      <w:rFonts w:ascii="TWK Everett Medium" w:hAnsi="TWK Everett Medium"/>
+      <w:b w:val="0"/>
       <w:bCs/>
       <w:color w:val="1C2B33"/>
-      <w:sz w:val="26"/>
+      <w:sz w:val="27"/>
       <w:szCs w:val="26"/>
     </w:rPr>
   </w:style>
@@ -4136,12 +4141,12 @@
       <w:contextualSpacing/>
     </w:pPr>
     <w:rPr>
-      <w:rFonts w:ascii="Arial" w:hAnsi="Arial"/>
-      <w:b/>
+      <w:rFonts w:ascii="TWK Everett Black" w:hAnsi="TWK Everett Black"/>
+      <w:b w:val="0"/>
       <w:color w:val="1C2B33"/>
       <w:spacing w:val="5"/>
       <w:kern w:val="28"/>
-      <w:sz w:val="64"/>
+      <w:sz w:val="67"/>
       <w:szCs w:val="52"/>
     </w:rPr>
   </w:style>

</xml_diff>